<commit_message>
Fixes on the graph
</commit_message>
<xml_diff>
--- a/Izvještaj o završnom radu.docx
+++ b/Izvještaj o završnom radu.docx
@@ -59,6 +59,9 @@
     </w:p>
     <w:p>
       <w:r>
+        <w:rPr>
+          <w:noProof/>
+        </w:rPr>
         <w:drawing>
           <wp:inline distT="0" distB="0" distL="0" distR="0" wp14:anchorId="7F02540B" wp14:editId="26EE265D">
             <wp:extent cx="5760720" cy="3003550"/>
@@ -111,6 +114,9 @@
     </w:p>
     <w:p>
       <w:r>
+        <w:rPr>
+          <w:noProof/>
+        </w:rPr>
         <w:drawing>
           <wp:inline distT="0" distB="0" distL="0" distR="0" wp14:anchorId="3C2046CE" wp14:editId="61391F75">
             <wp:extent cx="5760720" cy="955040"/>
@@ -155,6 +161,9 @@
     </w:p>
     <w:p>
       <w:r>
+        <w:rPr>
+          <w:noProof/>
+        </w:rPr>
         <w:lastRenderedPageBreak/>
         <w:drawing>
           <wp:inline distT="0" distB="0" distL="0" distR="0" wp14:anchorId="1CE60E59" wp14:editId="61D04C5A">
@@ -264,6 +273,9 @@
     </w:p>
     <w:p>
       <w:r>
+        <w:rPr>
+          <w:noProof/>
+        </w:rPr>
         <w:drawing>
           <wp:inline distT="0" distB="0" distL="0" distR="0" wp14:anchorId="59FE0CB8" wp14:editId="24DCCA64">
             <wp:extent cx="4970145" cy="330357"/>
@@ -303,6 +315,9 @@
     </w:p>
     <w:p>
       <w:r>
+        <w:rPr>
+          <w:noProof/>
+        </w:rPr>
         <w:drawing>
           <wp:inline distT="0" distB="0" distL="0" distR="0" wp14:anchorId="7BD7FC15" wp14:editId="71CCA252">
             <wp:extent cx="4893945" cy="330687"/>
@@ -387,6 +402,9 @@
     </w:p>
     <w:p>
       <w:r>
+        <w:rPr>
+          <w:noProof/>
+        </w:rPr>
         <w:drawing>
           <wp:inline distT="0" distB="0" distL="0" distR="0" wp14:anchorId="06807119" wp14:editId="19F3BB21">
             <wp:extent cx="5760720" cy="1170305"/>
@@ -426,6 +444,9 @@
     </w:p>
     <w:p>
       <w:r>
+        <w:rPr>
+          <w:noProof/>
+        </w:rPr>
         <w:lastRenderedPageBreak/>
         <w:drawing>
           <wp:inline distT="0" distB="0" distL="0" distR="0" wp14:anchorId="2599B90D" wp14:editId="2333F971">
@@ -525,6 +546,9 @@
     </w:p>
     <w:p>
       <w:r>
+        <w:rPr>
+          <w:noProof/>
+        </w:rPr>
         <w:drawing>
           <wp:inline distT="0" distB="0" distL="0" distR="0" wp14:anchorId="6445BC42" wp14:editId="44190467">
             <wp:extent cx="4336733" cy="3673699"/>
@@ -564,6 +588,9 @@
     </w:p>
     <w:p>
       <w:r>
+        <w:rPr>
+          <w:noProof/>
+        </w:rPr>
         <w:drawing>
           <wp:inline distT="0" distB="0" distL="0" distR="0" wp14:anchorId="39FE9477" wp14:editId="76DAC581">
             <wp:extent cx="5432108" cy="641291"/>
@@ -641,6 +668,232 @@
         <w:t>Odabirom treninga iz padajućeg izbornika korisniku se prikazuje sljedeće:</w:t>
       </w:r>
     </w:p>
+    <w:p>
+      <w:r>
+        <w:rPr>
+          <w:noProof/>
+        </w:rPr>
+        <w:drawing>
+          <wp:inline distT="0" distB="0" distL="0" distR="0" wp14:anchorId="1117C535" wp14:editId="70518AAE">
+            <wp:extent cx="4955858" cy="2583907"/>
+            <wp:effectExtent l="0" t="0" r="0" b="6985"/>
+            <wp:docPr id="364682989" name="Slika 1"/>
+            <wp:cNvGraphicFramePr>
+              <a:graphicFrameLocks xmlns:a="http://schemas.openxmlformats.org/drawingml/2006/main" noChangeAspect="1"/>
+            </wp:cNvGraphicFramePr>
+            <a:graphic xmlns:a="http://schemas.openxmlformats.org/drawingml/2006/main">
+              <a:graphicData uri="http://schemas.openxmlformats.org/drawingml/2006/picture">
+                <pic:pic xmlns:pic="http://schemas.openxmlformats.org/drawingml/2006/picture">
+                  <pic:nvPicPr>
+                    <pic:cNvPr id="364682989" name="Slika 364682989"/>
+                    <pic:cNvPicPr/>
+                  </pic:nvPicPr>
+                  <pic:blipFill>
+                    <a:blip r:embed="rId14" cstate="print">
+                      <a:extLst>
+                        <a:ext uri="{28A0092B-C50C-407E-A947-70E740481C1C}">
+                          <a14:useLocalDpi xmlns:a14="http://schemas.microsoft.com/office/drawing/2010/main" val="0"/>
+                        </a:ext>
+                      </a:extLst>
+                    </a:blip>
+                    <a:stretch>
+                      <a:fillRect/>
+                    </a:stretch>
+                  </pic:blipFill>
+                  <pic:spPr>
+                    <a:xfrm>
+                      <a:off x="0" y="0"/>
+                      <a:ext cx="4967055" cy="2589745"/>
+                    </a:xfrm>
+                    <a:prstGeom prst="rect">
+                      <a:avLst/>
+                    </a:prstGeom>
+                  </pic:spPr>
+                </pic:pic>
+              </a:graphicData>
+            </a:graphic>
+          </wp:inline>
+        </w:drawing>
+      </w:r>
+    </w:p>
+    <w:p>
+      <w:r>
+        <w:rPr>
+          <w:noProof/>
+        </w:rPr>
+        <w:drawing>
+          <wp:inline distT="0" distB="0" distL="0" distR="0" wp14:anchorId="7EB2D050" wp14:editId="47735A58">
+            <wp:extent cx="4974908" cy="2527486"/>
+            <wp:effectExtent l="0" t="0" r="0" b="6350"/>
+            <wp:docPr id="2107404419" name="Slika 2"/>
+            <wp:cNvGraphicFramePr>
+              <a:graphicFrameLocks xmlns:a="http://schemas.openxmlformats.org/drawingml/2006/main" noChangeAspect="1"/>
+            </wp:cNvGraphicFramePr>
+            <a:graphic xmlns:a="http://schemas.openxmlformats.org/drawingml/2006/main">
+              <a:graphicData uri="http://schemas.openxmlformats.org/drawingml/2006/picture">
+                <pic:pic xmlns:pic="http://schemas.openxmlformats.org/drawingml/2006/picture">
+                  <pic:nvPicPr>
+                    <pic:cNvPr id="2107404419" name="Slika 2107404419"/>
+                    <pic:cNvPicPr/>
+                  </pic:nvPicPr>
+                  <pic:blipFill>
+                    <a:blip r:embed="rId15" cstate="print">
+                      <a:extLst>
+                        <a:ext uri="{28A0092B-C50C-407E-A947-70E740481C1C}">
+                          <a14:useLocalDpi xmlns:a14="http://schemas.microsoft.com/office/drawing/2010/main" val="0"/>
+                        </a:ext>
+                      </a:extLst>
+                    </a:blip>
+                    <a:stretch>
+                      <a:fillRect/>
+                    </a:stretch>
+                  </pic:blipFill>
+                  <pic:spPr>
+                    <a:xfrm>
+                      <a:off x="0" y="0"/>
+                      <a:ext cx="4991750" cy="2536043"/>
+                    </a:xfrm>
+                    <a:prstGeom prst="rect">
+                      <a:avLst/>
+                    </a:prstGeom>
+                  </pic:spPr>
+                </pic:pic>
+              </a:graphicData>
+            </a:graphic>
+          </wp:inline>
+        </w:drawing>
+      </w:r>
+    </w:p>
+    <w:p>
+      <w:r>
+        <w:rPr>
+          <w:noProof/>
+        </w:rPr>
+        <w:lastRenderedPageBreak/>
+        <w:drawing>
+          <wp:inline distT="0" distB="0" distL="0" distR="0" wp14:anchorId="04DADA5D" wp14:editId="6AE3FD25">
+            <wp:extent cx="4746308" cy="1839508"/>
+            <wp:effectExtent l="0" t="0" r="0" b="8890"/>
+            <wp:docPr id="1370517969" name="Slika 3"/>
+            <wp:cNvGraphicFramePr>
+              <a:graphicFrameLocks xmlns:a="http://schemas.openxmlformats.org/drawingml/2006/main" noChangeAspect="1"/>
+            </wp:cNvGraphicFramePr>
+            <a:graphic xmlns:a="http://schemas.openxmlformats.org/drawingml/2006/main">
+              <a:graphicData uri="http://schemas.openxmlformats.org/drawingml/2006/picture">
+                <pic:pic xmlns:pic="http://schemas.openxmlformats.org/drawingml/2006/picture">
+                  <pic:nvPicPr>
+                    <pic:cNvPr id="1370517969" name="Slika 1370517969"/>
+                    <pic:cNvPicPr/>
+                  </pic:nvPicPr>
+                  <pic:blipFill>
+                    <a:blip r:embed="rId16" cstate="print">
+                      <a:extLst>
+                        <a:ext uri="{28A0092B-C50C-407E-A947-70E740481C1C}">
+                          <a14:useLocalDpi xmlns:a14="http://schemas.microsoft.com/office/drawing/2010/main" val="0"/>
+                        </a:ext>
+                      </a:extLst>
+                    </a:blip>
+                    <a:stretch>
+                      <a:fillRect/>
+                    </a:stretch>
+                  </pic:blipFill>
+                  <pic:spPr>
+                    <a:xfrm>
+                      <a:off x="0" y="0"/>
+                      <a:ext cx="4768522" cy="1848118"/>
+                    </a:xfrm>
+                    <a:prstGeom prst="rect">
+                      <a:avLst/>
+                    </a:prstGeom>
+                  </pic:spPr>
+                </pic:pic>
+              </a:graphicData>
+            </a:graphic>
+          </wp:inline>
+        </w:drawing>
+      </w:r>
+    </w:p>
+    <w:p>
+      <w:r>
+        <w:rPr>
+          <w:noProof/>
+        </w:rPr>
+        <w:drawing>
+          <wp:inline distT="0" distB="0" distL="0" distR="0" wp14:anchorId="4D9C6DC7" wp14:editId="0A293BB3">
+            <wp:extent cx="4755833" cy="1143874"/>
+            <wp:effectExtent l="0" t="0" r="6985" b="0"/>
+            <wp:docPr id="815704493" name="Slika 4"/>
+            <wp:cNvGraphicFramePr>
+              <a:graphicFrameLocks xmlns:a="http://schemas.openxmlformats.org/drawingml/2006/main" noChangeAspect="1"/>
+            </wp:cNvGraphicFramePr>
+            <a:graphic xmlns:a="http://schemas.openxmlformats.org/drawingml/2006/main">
+              <a:graphicData uri="http://schemas.openxmlformats.org/drawingml/2006/picture">
+                <pic:pic xmlns:pic="http://schemas.openxmlformats.org/drawingml/2006/picture">
+                  <pic:nvPicPr>
+                    <pic:cNvPr id="815704493" name="Slika 815704493"/>
+                    <pic:cNvPicPr/>
+                  </pic:nvPicPr>
+                  <pic:blipFill>
+                    <a:blip r:embed="rId17" cstate="print">
+                      <a:extLst>
+                        <a:ext uri="{28A0092B-C50C-407E-A947-70E740481C1C}">
+                          <a14:useLocalDpi xmlns:a14="http://schemas.microsoft.com/office/drawing/2010/main" val="0"/>
+                        </a:ext>
+                      </a:extLst>
+                    </a:blip>
+                    <a:stretch>
+                      <a:fillRect/>
+                    </a:stretch>
+                  </pic:blipFill>
+                  <pic:spPr>
+                    <a:xfrm>
+                      <a:off x="0" y="0"/>
+                      <a:ext cx="4794112" cy="1153081"/>
+                    </a:xfrm>
+                    <a:prstGeom prst="rect">
+                      <a:avLst/>
+                    </a:prstGeom>
+                  </pic:spPr>
+                </pic:pic>
+              </a:graphicData>
+            </a:graphic>
+          </wp:inline>
+        </w:drawing>
+      </w:r>
+    </w:p>
+    <w:p>
+      <w:r>
+        <w:t xml:space="preserve">Za odabrani trening korisnik može vidjeti graf sa </w:t>
+      </w:r>
+      <w:r>
+        <w:t>jačinom udaraca (silom), osnovnu statistiku (broj udaraca, trajanje, prosječno udaraca, udarci/min), naprednu statistiku (najduža serija – udarci bez prestanka u kratkom vremenu</w:t>
+      </w:r>
+      <w:r>
+        <w:t xml:space="preserve">, pad snage – usporedba prve trećine treninga sa zadnjom, distribuciju snage – </w:t>
+      </w:r>
+      <w:proofErr w:type="spellStart"/>
+      <w:r>
+        <w:t>histogram</w:t>
+      </w:r>
+      <w:proofErr w:type="spellEnd"/>
+      <w:r>
+        <w:t xml:space="preserve"> sa brojem udaraca u određenoj kategoriji jačine) i usporedbu s prethodnim treningom.</w:t>
+      </w:r>
+    </w:p>
+    <w:p>
+      <w:r>
+        <w:t>*Napomena – u mobilnoj aplikaciji su implementirane funkcije samo moram dodati prikaz naprednih statistika.</w:t>
+      </w:r>
+    </w:p>
+    <w:p>
+      <w:pPr>
+        <w:pStyle w:val="Naslov3"/>
+      </w:pPr>
+      <w:r>
+        <w:t>Kod</w:t>
+      </w:r>
+    </w:p>
+    <w:p/>
     <w:p/>
     <w:p/>
     <w:p/>

</xml_diff>

<commit_message>
Frontend|upd: combining home and data page into one
</commit_message>
<xml_diff>
--- a/Izvještaj o završnom radu.docx
+++ b/Izvještaj o završnom radu.docx
@@ -15,13 +15,8 @@
         <w:pStyle w:val="Naslov1"/>
       </w:pPr>
       <w:r>
-        <w:t xml:space="preserve">Home </w:t>
-      </w:r>
-      <w:proofErr w:type="spellStart"/>
-      <w:r>
-        <w:t>page</w:t>
-      </w:r>
-      <w:proofErr w:type="spellEnd"/>
+        <w:t>Home page</w:t>
+      </w:r>
     </w:p>
     <w:p>
       <w:r>
@@ -46,15 +41,7 @@
     </w:p>
     <w:p>
       <w:r>
-        <w:t xml:space="preserve">Kad se korisnik ulogira odvede ga na home stranicu aplikacije. Na njoj ima mogućnost skeniranja </w:t>
-      </w:r>
-      <w:proofErr w:type="spellStart"/>
-      <w:r>
-        <w:t>qr</w:t>
-      </w:r>
-      <w:proofErr w:type="spellEnd"/>
-      <w:r>
-        <w:t xml:space="preserve">-koda i pokretanja treninga (sesije) ili prijelaz na stranicu s podatcima o treninzima. </w:t>
+        <w:t xml:space="preserve">Kad se korisnik ulogira odvede ga na home stranicu aplikacije. Na njoj ima mogućnost skeniranja qr-koda i pokretanja treninga (sesije) ili prijelaz na stranicu s podatcima o treninzima. </w:t>
       </w:r>
     </w:p>
     <w:p>
@@ -101,15 +88,7 @@
     </w:p>
     <w:p>
       <w:r>
-        <w:t xml:space="preserve">Pritiskom na gumb „Otvori </w:t>
-      </w:r>
-      <w:proofErr w:type="spellStart"/>
-      <w:r>
-        <w:t>qr</w:t>
-      </w:r>
-      <w:proofErr w:type="spellEnd"/>
-      <w:r>
-        <w:t xml:space="preserve"> skener“ otvara se kamera i omogućuje skeniranje koda i pokretanje treninga. U slučaju da aplikacija nema pristup kameri prikazuje se obrazac za ručno spajanje s vrećom:</w:t>
+        <w:t>Pritiskom na gumb „Otvori qr skener“ otvara se kamera i omogućuje skeniranje koda i pokretanje treninga. U slučaju da aplikacija nema pristup kameri prikazuje se obrazac za ručno spajanje s vrećom:</w:t>
       </w:r>
     </w:p>
     <w:p>
@@ -220,55 +199,7 @@
     </w:p>
     <w:p>
       <w:r>
-        <w:t xml:space="preserve">Dodani </w:t>
-      </w:r>
-      <w:proofErr w:type="spellStart"/>
-      <w:r>
-        <w:t>AuthProvider.jsx</w:t>
-      </w:r>
-      <w:proofErr w:type="spellEnd"/>
-      <w:r>
-        <w:t xml:space="preserve"> i </w:t>
-      </w:r>
-      <w:proofErr w:type="spellStart"/>
-      <w:r>
-        <w:t>ProtectedRoute.jsx</w:t>
-      </w:r>
-      <w:proofErr w:type="spellEnd"/>
-      <w:r>
-        <w:t xml:space="preserve"> koji olakšavaju spajanje na </w:t>
-      </w:r>
-      <w:proofErr w:type="spellStart"/>
-      <w:r>
-        <w:t>WebSocket</w:t>
-      </w:r>
-      <w:proofErr w:type="spellEnd"/>
-      <w:r>
-        <w:t xml:space="preserve"> putem kojeg ide komunikacija sa serverom. (smanjuje se broj spajanja i </w:t>
-      </w:r>
-      <w:proofErr w:type="spellStart"/>
-      <w:r>
-        <w:t>odspajanja</w:t>
-      </w:r>
-      <w:proofErr w:type="spellEnd"/>
-      <w:r>
-        <w:t xml:space="preserve"> s </w:t>
-      </w:r>
-      <w:proofErr w:type="spellStart"/>
-      <w:r>
-        <w:t>WebSocketa</w:t>
-      </w:r>
-      <w:proofErr w:type="spellEnd"/>
-      <w:r>
-        <w:t xml:space="preserve"> i ne učitava stranicu prije nego se spoji). Također je ograničen pristup na stranice Home, Dana samo </w:t>
-      </w:r>
-      <w:proofErr w:type="spellStart"/>
-      <w:r>
-        <w:t>ulogiranim</w:t>
-      </w:r>
-      <w:proofErr w:type="spellEnd"/>
-      <w:r>
-        <w:t xml:space="preserve"> korisnicima.</w:t>
+        <w:t>Dodani AuthProvider.jsx i ProtectedRoute.jsx koji olakšavaju spajanje na WebSocket putem kojeg ide komunikacija sa serverom. (smanjuje se broj spajanja i odspajanja s WebSocketa i ne učitava stranicu prije nego se spoji). Također je ograničen pristup na stranice Home, Dana samo ulogiranim korisnicima.</w:t>
       </w:r>
     </w:p>
     <w:p>
@@ -365,39 +296,7 @@
     </w:p>
     <w:p>
       <w:r>
-        <w:t xml:space="preserve">U </w:t>
-      </w:r>
-      <w:proofErr w:type="spellStart"/>
-      <w:r>
-        <w:t>QrScanner.jsx</w:t>
-      </w:r>
-      <w:proofErr w:type="spellEnd"/>
-      <w:r>
-        <w:t xml:space="preserve"> dodana je opcija da ako se ne može pristupiti kameri da se otvara </w:t>
-      </w:r>
-      <w:proofErr w:type="spellStart"/>
-      <w:r>
-        <w:t>form</w:t>
-      </w:r>
-      <w:proofErr w:type="spellEnd"/>
-      <w:r>
-        <w:t xml:space="preserve"> obrazac koji korisnik ispunjava sa </w:t>
-      </w:r>
-      <w:proofErr w:type="spellStart"/>
-      <w:r>
-        <w:t>id-om</w:t>
-      </w:r>
-      <w:proofErr w:type="spellEnd"/>
-      <w:r>
-        <w:t xml:space="preserve"> vreće, težinom i elastičnosti. Pritiskom na „Pošalji“ podatci se šalju u formi u kakvoj bi se poslali i da je bio skeniran </w:t>
-      </w:r>
-      <w:proofErr w:type="spellStart"/>
-      <w:r>
-        <w:t>qr</w:t>
-      </w:r>
-      <w:proofErr w:type="spellEnd"/>
-      <w:r>
-        <w:t>-kod.</w:t>
+        <w:t>U QrScanner.jsx dodana je opcija da ako se ne može pristupiti kameri da se otvara form obrazac koji korisnik ispunjava sa id-om vreće, težinom i elastičnosti. Pritiskom na „Pošalji“ podatci se šalju u formi u kakvoj bi se poslali i da je bio skeniran qr-kod.</w:t>
       </w:r>
     </w:p>
     <w:p>
@@ -495,31 +394,7 @@
     </w:p>
     <w:p>
       <w:r>
-        <w:t xml:space="preserve">Dodana je komponenta </w:t>
-      </w:r>
-      <w:proofErr w:type="spellStart"/>
-      <w:r>
-        <w:t>Stopwatch.jsx</w:t>
-      </w:r>
-      <w:proofErr w:type="spellEnd"/>
-      <w:r>
-        <w:t xml:space="preserve"> koja se implementira na Home </w:t>
-      </w:r>
-      <w:proofErr w:type="spellStart"/>
-      <w:r>
-        <w:t>page</w:t>
-      </w:r>
-      <w:proofErr w:type="spellEnd"/>
-      <w:r>
-        <w:t xml:space="preserve">-u kada je aktivna sesija. Ispisuje vrijeme u formatu: </w:t>
-      </w:r>
-      <w:proofErr w:type="spellStart"/>
-      <w:r>
-        <w:t>mm:ss:ds</w:t>
-      </w:r>
-      <w:proofErr w:type="spellEnd"/>
-      <w:r>
-        <w:t xml:space="preserve"> (desetinke sekunde). Ona se prekida kad se prekine sesija (pritisak na gumb Stop ili </w:t>
+        <w:t xml:space="preserve">Dodana je komponenta Stopwatch.jsx koja se implementira na Home page-u kada je aktivna sesija. Ispisuje vrijeme u formatu: mm:ss:ds (desetinke sekunde). Ona se prekida kad se prekine sesija (pritisak na gumb Stop ili </w:t>
       </w:r>
       <w:r>
         <w:t>pokretanje sesije od strane drugog korisnika)</w:t>
@@ -533,15 +408,7 @@
         <w:sym w:font="Wingdings" w:char="F0E0"/>
       </w:r>
       <w:r>
-        <w:t xml:space="preserve"> ne ispisuje brojke, pa trenutno </w:t>
-      </w:r>
-      <w:proofErr w:type="spellStart"/>
-      <w:r>
-        <w:t>debuggiram</w:t>
-      </w:r>
-      <w:proofErr w:type="spellEnd"/>
-      <w:r>
-        <w:t xml:space="preserve"> zašto se to događa.</w:t>
+        <w:t xml:space="preserve"> ne ispisuje brojke, pa trenutno debuggiram zašto se to događa.</w:t>
       </w:r>
     </w:p>
     <w:p>
@@ -634,13 +501,8 @@
       </w:pPr>
       <w:r>
         <w:lastRenderedPageBreak/>
-        <w:t xml:space="preserve">Data </w:t>
-      </w:r>
-      <w:proofErr w:type="spellStart"/>
-      <w:r>
-        <w:t>page</w:t>
-      </w:r>
-      <w:proofErr w:type="spellEnd"/>
+        <w:t>Data page</w:t>
+      </w:r>
     </w:p>
     <w:p>
       <w:pPr>
@@ -869,15 +731,7 @@
         <w:t>jačinom udaraca (silom), osnovnu statistiku (broj udaraca, trajanje, prosječno udaraca, udarci/min), naprednu statistiku (najduža serija – udarci bez prestanka u kratkom vremenu</w:t>
       </w:r>
       <w:r>
-        <w:t xml:space="preserve">, pad snage – usporedba prve trećine treninga sa zadnjom, distribuciju snage – </w:t>
-      </w:r>
-      <w:proofErr w:type="spellStart"/>
-      <w:r>
-        <w:t>histogram</w:t>
-      </w:r>
-      <w:proofErr w:type="spellEnd"/>
-      <w:r>
-        <w:t xml:space="preserve"> sa brojem udaraca u određenoj kategoriji jačine) i usporedbu s prethodnim treningom.</w:t>
+        <w:t>, pad snage – usporedba prve trećine treninga sa zadnjom, distribuciju snage – histogram sa brojem udaraca u određenoj kategoriji jačine) i usporedbu s prethodnim treningom.</w:t>
       </w:r>
     </w:p>
     <w:p>
@@ -893,7 +747,117 @@
         <w:t>Kod</w:t>
       </w:r>
     </w:p>
-    <w:p/>
+    <w:p>
+      <w:pPr>
+        <w:pStyle w:val="Naslov4"/>
+      </w:pPr>
+      <w:r>
+        <w:t>Najveća serija udaraca</w:t>
+      </w:r>
+    </w:p>
+    <w:p>
+      <w:r>
+        <w:t xml:space="preserve">Implementirana funkcija gleda najveći </w:t>
+      </w:r>
+      <w:r>
+        <w:t xml:space="preserve">broj udaraca za redom u kratkom vremenu (1500 ms). Funkcija vraća </w:t>
+      </w:r>
+      <w:r>
+        <w:t xml:space="preserve">duljinu serije i njen početak i kraj (timestamp). </w:t>
+      </w:r>
+    </w:p>
+    <w:p>
+      <w:r>
+        <w:lastRenderedPageBreak/>
+        <w:drawing>
+          <wp:inline distT="0" distB="0" distL="0" distR="0" wp14:anchorId="24CC766A" wp14:editId="7BC96AFB">
+            <wp:extent cx="4508183" cy="4714907"/>
+            <wp:effectExtent l="0" t="0" r="6985" b="0"/>
+            <wp:docPr id="1102198069" name="Slika 1"/>
+            <wp:cNvGraphicFramePr>
+              <a:graphicFrameLocks xmlns:a="http://schemas.openxmlformats.org/drawingml/2006/main" noChangeAspect="1"/>
+            </wp:cNvGraphicFramePr>
+            <a:graphic xmlns:a="http://schemas.openxmlformats.org/drawingml/2006/main">
+              <a:graphicData uri="http://schemas.openxmlformats.org/drawingml/2006/picture">
+                <pic:pic xmlns:pic="http://schemas.openxmlformats.org/drawingml/2006/picture">
+                  <pic:nvPicPr>
+                    <pic:cNvPr id="1102198069" name=""/>
+                    <pic:cNvPicPr/>
+                  </pic:nvPicPr>
+                  <pic:blipFill>
+                    <a:blip r:embed="rId18"/>
+                    <a:stretch>
+                      <a:fillRect/>
+                    </a:stretch>
+                  </pic:blipFill>
+                  <pic:spPr>
+                    <a:xfrm>
+                      <a:off x="0" y="0"/>
+                      <a:ext cx="4514341" cy="4721348"/>
+                    </a:xfrm>
+                    <a:prstGeom prst="rect">
+                      <a:avLst/>
+                    </a:prstGeom>
+                  </pic:spPr>
+                </pic:pic>
+              </a:graphicData>
+            </a:graphic>
+          </wp:inline>
+        </w:drawing>
+      </w:r>
+    </w:p>
+    <w:p>
+      <w:pPr>
+        <w:pStyle w:val="Naslov4"/>
+      </w:pPr>
+      <w:r>
+        <w:t>Pad snage</w:t>
+      </w:r>
+    </w:p>
+    <w:p>
+      <w:r>
+        <w:t>Funkcija gleda prosječnu snagu udaraca u prvoj i zadnjoj trećini treninga i uspoređuje ih. Ispisuje postotak pada/rasta snage u treningu.</w:t>
+      </w:r>
+    </w:p>
+    <w:p>
+      <w:r>
+        <w:drawing>
+          <wp:inline distT="0" distB="0" distL="0" distR="0" wp14:anchorId="1409FE5E" wp14:editId="0BEBB844">
+            <wp:extent cx="4169701" cy="3045463"/>
+            <wp:effectExtent l="0" t="0" r="2540" b="2540"/>
+            <wp:docPr id="813845408" name="Slika 1"/>
+            <wp:cNvGraphicFramePr>
+              <a:graphicFrameLocks xmlns:a="http://schemas.openxmlformats.org/drawingml/2006/main" noChangeAspect="1"/>
+            </wp:cNvGraphicFramePr>
+            <a:graphic xmlns:a="http://schemas.openxmlformats.org/drawingml/2006/main">
+              <a:graphicData uri="http://schemas.openxmlformats.org/drawingml/2006/picture">
+                <pic:pic xmlns:pic="http://schemas.openxmlformats.org/drawingml/2006/picture">
+                  <pic:nvPicPr>
+                    <pic:cNvPr id="813845408" name=""/>
+                    <pic:cNvPicPr/>
+                  </pic:nvPicPr>
+                  <pic:blipFill>
+                    <a:blip r:embed="rId19"/>
+                    <a:stretch>
+                      <a:fillRect/>
+                    </a:stretch>
+                  </pic:blipFill>
+                  <pic:spPr>
+                    <a:xfrm>
+                      <a:off x="0" y="0"/>
+                      <a:ext cx="4182260" cy="3054636"/>
+                    </a:xfrm>
+                    <a:prstGeom prst="rect">
+                      <a:avLst/>
+                    </a:prstGeom>
+                  </pic:spPr>
+                </pic:pic>
+              </a:graphicData>
+            </a:graphic>
+          </wp:inline>
+        </w:drawing>
+      </w:r>
+    </w:p>
     <w:p/>
     <w:p/>
     <w:p/>

</xml_diff>